<commit_message>
Fix : Coorected the analysis behaviour
</commit_message>
<xml_diff>
--- a/backend/templates/resume_format.docx
+++ b/backend/templates/resume_format.docx
@@ -439,6 +439,10 @@
     <w:p>
       <w:pPr>
         <w:spacing w:after="0"/>
+        <w:rPr>
+          <w:sz w:val="18"/>
+          <w:szCs w:val="18"/>
+        </w:rPr>
       </w:pPr>
     </w:p>
     <w:p>
@@ -729,14 +733,7 @@
           <w:b/>
           <w:sz w:val="18"/>
         </w:rPr>
-        <w:t>.</w:t>
-      </w:r>
-      <w:r>
-        <w:rPr>
-          <w:b/>
-          <w:sz w:val="18"/>
-        </w:rPr>
-        <w:t>position</w:t>
+        <w:t>.position</w:t>
       </w:r>
       <w:proofErr w:type="spellEnd"/>
       <w:proofErr w:type="gramEnd"/>
@@ -749,55 +746,31 @@
       </w:r>
       <w:r>
         <w:rPr>
-          <w:sz w:val="18"/>
-        </w:rPr>
-        <w:t>{{company</w:t>
-      </w:r>
-      <w:r>
-        <w:rPr>
-          <w:sz w:val="18"/>
-        </w:rPr>
-        <w:t>.name</w:t>
-      </w:r>
-      <w:r>
-        <w:rPr>
-          <w:sz w:val="18"/>
-        </w:rPr>
-        <w:t>}} ({{</w:t>
+          <w:i/>
+          <w:iCs/>
+          <w:sz w:val="18"/>
+        </w:rPr>
+        <w:t>{{company.name}} ({{</w:t>
       </w:r>
       <w:proofErr w:type="spellStart"/>
       <w:proofErr w:type="gramStart"/>
       <w:r>
         <w:rPr>
-          <w:sz w:val="18"/>
-        </w:rPr>
-        <w:t>company.</w:t>
-      </w:r>
-      <w:r>
-        <w:rPr>
-          <w:sz w:val="18"/>
-        </w:rPr>
-        <w:t>from</w:t>
+          <w:i/>
+          <w:iCs/>
+          <w:sz w:val="18"/>
+        </w:rPr>
+        <w:t>company.from</w:t>
       </w:r>
       <w:proofErr w:type="spellEnd"/>
       <w:proofErr w:type="gramEnd"/>
       <w:r>
         <w:rPr>
-          <w:sz w:val="18"/>
-        </w:rPr>
-        <w:t>}} – {{</w:t>
-      </w:r>
-      <w:r>
-        <w:rPr>
-          <w:sz w:val="18"/>
-        </w:rPr>
-        <w:t>company.</w:t>
-      </w:r>
-      <w:r>
-        <w:rPr>
-          <w:sz w:val="18"/>
-        </w:rPr>
-        <w:t>to}})</w:t>
+          <w:i/>
+          <w:iCs/>
+          <w:sz w:val="18"/>
+        </w:rPr>
+        <w:t>}} – {{company.to}})</w:t>
       </w:r>
     </w:p>
     <w:p>
@@ -980,21 +953,7 @@
           <w:b/>
           <w:sz w:val="18"/>
         </w:rPr>
-        <w:t>project</w:t>
-      </w:r>
-      <w:r>
-        <w:rPr>
-          <w:b/>
-          <w:sz w:val="18"/>
-        </w:rPr>
-        <w:t>.</w:t>
-      </w:r>
-      <w:r>
-        <w:rPr>
-          <w:b/>
-          <w:sz w:val="18"/>
-        </w:rPr>
-        <w:t>title</w:t>
+        <w:t>project.title</w:t>
       </w:r>
       <w:proofErr w:type="spellEnd"/>
       <w:proofErr w:type="gramEnd"/>
@@ -1007,6 +966,8 @@
       </w:r>
       <w:r>
         <w:rPr>
+          <w:i/>
+          <w:iCs/>
           <w:sz w:val="18"/>
         </w:rPr>
         <w:t>{{</w:t>
@@ -1015,19 +976,17 @@
       <w:proofErr w:type="gramStart"/>
       <w:r>
         <w:rPr>
-          <w:sz w:val="18"/>
-        </w:rPr>
-        <w:t>project.</w:t>
-      </w:r>
-      <w:r>
-        <w:rPr>
-          <w:sz w:val="18"/>
-        </w:rPr>
-        <w:t>tools</w:t>
+          <w:i/>
+          <w:iCs/>
+          <w:sz w:val="18"/>
+        </w:rPr>
+        <w:t>project.tools</w:t>
       </w:r>
       <w:proofErr w:type="gramEnd"/>
       <w:r>
         <w:rPr>
+          <w:i/>
+          <w:iCs/>
           <w:sz w:val="18"/>
         </w:rPr>
         <w:t>_used</w:t>
@@ -1036,19 +995,17 @@
       <w:proofErr w:type="gramStart"/>
       <w:r>
         <w:rPr>
-          <w:sz w:val="18"/>
-        </w:rPr>
-        <w:t>}}</w:t>
-      </w:r>
-      <w:r>
-        <w:rPr>
-          <w:sz w:val="18"/>
-        </w:rPr>
-        <w:t>{</w:t>
+          <w:i/>
+          <w:iCs/>
+          <w:sz w:val="18"/>
+        </w:rPr>
+        <w:t>}}{</w:t>
       </w:r>
       <w:proofErr w:type="gramEnd"/>
       <w:r>
         <w:rPr>
+          <w:i/>
+          <w:iCs/>
           <w:sz w:val="18"/>
         </w:rPr>
         <w:t xml:space="preserve">% if </w:t>
@@ -1057,19 +1014,17 @@
       <w:proofErr w:type="gramStart"/>
       <w:r>
         <w:rPr>
-          <w:sz w:val="18"/>
-        </w:rPr>
-        <w:t>project.</w:t>
-      </w:r>
-      <w:r>
-        <w:rPr>
-          <w:sz w:val="18"/>
-        </w:rPr>
-        <w:t>project</w:t>
+          <w:i/>
+          <w:iCs/>
+          <w:sz w:val="18"/>
+        </w:rPr>
+        <w:t>project.project</w:t>
       </w:r>
       <w:proofErr w:type="gramEnd"/>
       <w:r>
         <w:rPr>
+          <w:i/>
+          <w:iCs/>
           <w:sz w:val="18"/>
         </w:rPr>
         <w:t>_link</w:t>
@@ -1077,51 +1032,27 @@
       <w:proofErr w:type="spellEnd"/>
       <w:r>
         <w:rPr>
-          <w:sz w:val="18"/>
-        </w:rPr>
-        <w:t xml:space="preserve"> %}</w:t>
-      </w:r>
-      <w:r>
-        <w:rPr>
-          <w:sz w:val="18"/>
-        </w:rPr>
-        <w:t xml:space="preserve"> </w:t>
-      </w:r>
-      <w:r>
-        <w:rPr>
-          <w:sz w:val="18"/>
-        </w:rPr>
-        <w:t>|</w:t>
-      </w:r>
-      <w:r>
-        <w:rPr>
-          <w:sz w:val="18"/>
-        </w:rPr>
-        <w:t xml:space="preserve"> </w:t>
-      </w:r>
-      <w:r>
-        <w:rPr>
-          <w:sz w:val="18"/>
-        </w:rPr>
-        <w:t>{{</w:t>
+          <w:i/>
+          <w:iCs/>
+          <w:sz w:val="18"/>
+        </w:rPr>
+        <w:t xml:space="preserve"> %} | {{</w:t>
       </w:r>
       <w:proofErr w:type="spellStart"/>
       <w:proofErr w:type="gramStart"/>
       <w:r>
         <w:rPr>
-          <w:sz w:val="18"/>
-        </w:rPr>
-        <w:t>project.</w:t>
-      </w:r>
-      <w:r>
-        <w:rPr>
-          <w:sz w:val="18"/>
-        </w:rPr>
-        <w:t>project</w:t>
+          <w:i/>
+          <w:iCs/>
+          <w:sz w:val="18"/>
+        </w:rPr>
+        <w:t>project.project</w:t>
       </w:r>
       <w:proofErr w:type="gramEnd"/>
       <w:r>
         <w:rPr>
+          <w:i/>
+          <w:iCs/>
           <w:sz w:val="18"/>
         </w:rPr>
         <w:t>_link</w:t>
@@ -1130,6 +1061,8 @@
       <w:proofErr w:type="gramStart"/>
       <w:r>
         <w:rPr>
+          <w:i/>
+          <w:iCs/>
           <w:sz w:val="18"/>
         </w:rPr>
         <w:t>}}{</w:t>
@@ -1137,6 +1070,8 @@
       <w:proofErr w:type="gramEnd"/>
       <w:r>
         <w:rPr>
+          <w:i/>
+          <w:iCs/>
           <w:sz w:val="18"/>
         </w:rPr>
         <w:t>% endif %}</w:t>
@@ -1333,7 +1268,14 @@
         <w:rPr>
           <w:sz w:val="18"/>
         </w:rPr>
-        <w:t>{{education</w:t>
+        <w:t>{{</w:t>
+      </w:r>
+      <w:proofErr w:type="gramStart"/>
+      <w:r>
+        <w:rPr>
+          <w:sz w:val="18"/>
+        </w:rPr>
+        <w:t>education</w:t>
       </w:r>
       <w:r>
         <w:rPr>
@@ -1345,7 +1287,21 @@
         <w:rPr>
           <w:sz w:val="18"/>
         </w:rPr>
-        <w:t>field}} in {{education</w:t>
+        <w:t>field</w:t>
+      </w:r>
+      <w:proofErr w:type="gramEnd"/>
+      <w:r>
+        <w:rPr>
+          <w:sz w:val="18"/>
+        </w:rPr>
+        <w:t>}} in {{</w:t>
+      </w:r>
+      <w:proofErr w:type="gramStart"/>
+      <w:r>
+        <w:rPr>
+          <w:sz w:val="18"/>
+        </w:rPr>
+        <w:t>education</w:t>
       </w:r>
       <w:r>
         <w:rPr>
@@ -1365,47 +1321,98 @@
         </w:rPr>
         <w:t>ject</w:t>
       </w:r>
-      <w:r>
-        <w:rPr>
-          <w:sz w:val="18"/>
-        </w:rPr>
-        <w:t>}} | {{</w:t>
-      </w:r>
-      <w:r>
-        <w:rPr>
+      <w:proofErr w:type="gramEnd"/>
+      <w:r>
+        <w:rPr>
+          <w:sz w:val="18"/>
+        </w:rPr>
+        <w:t xml:space="preserve">}} | </w:t>
+      </w:r>
+      <w:r>
+        <w:rPr>
+          <w:i/>
+          <w:iCs/>
+          <w:sz w:val="18"/>
+        </w:rPr>
+        <w:t>{{</w:t>
+      </w:r>
+      <w:proofErr w:type="gramStart"/>
+      <w:r>
+        <w:rPr>
+          <w:i/>
+          <w:iCs/>
           <w:sz w:val="18"/>
         </w:rPr>
         <w:t>education.</w:t>
       </w:r>
       <w:r>
         <w:rPr>
-          <w:sz w:val="18"/>
-        </w:rPr>
-        <w:t>college}} ({{</w:t>
-      </w:r>
-      <w:r>
-        <w:rPr>
+          <w:i/>
+          <w:iCs/>
+          <w:sz w:val="18"/>
+        </w:rPr>
+        <w:t>college</w:t>
+      </w:r>
+      <w:proofErr w:type="gramEnd"/>
+      <w:r>
+        <w:rPr>
+          <w:i/>
+          <w:iCs/>
+          <w:sz w:val="18"/>
+        </w:rPr>
+        <w:t>}} ({{</w:t>
+      </w:r>
+      <w:proofErr w:type="gramStart"/>
+      <w:r>
+        <w:rPr>
+          <w:i/>
+          <w:iCs/>
           <w:sz w:val="18"/>
         </w:rPr>
         <w:t>education.</w:t>
       </w:r>
       <w:r>
         <w:rPr>
-          <w:sz w:val="18"/>
-        </w:rPr>
-        <w:t>college_from}} – {{</w:t>
-      </w:r>
-      <w:r>
-        <w:rPr>
+          <w:i/>
+          <w:iCs/>
+          <w:sz w:val="18"/>
+        </w:rPr>
+        <w:t>college</w:t>
+      </w:r>
+      <w:proofErr w:type="gramEnd"/>
+      <w:r>
+        <w:rPr>
+          <w:i/>
+          <w:iCs/>
+          <w:sz w:val="18"/>
+        </w:rPr>
+        <w:t>_from}} – {{</w:t>
+      </w:r>
+      <w:proofErr w:type="gramStart"/>
+      <w:r>
+        <w:rPr>
+          <w:i/>
+          <w:iCs/>
           <w:sz w:val="18"/>
         </w:rPr>
         <w:t>education.</w:t>
       </w:r>
       <w:r>
         <w:rPr>
-          <w:sz w:val="18"/>
-        </w:rPr>
-        <w:t>college_to}})</w:t>
+          <w:i/>
+          <w:iCs/>
+          <w:sz w:val="18"/>
+        </w:rPr>
+        <w:t>college</w:t>
+      </w:r>
+      <w:proofErr w:type="gramEnd"/>
+      <w:r>
+        <w:rPr>
+          <w:i/>
+          <w:iCs/>
+          <w:sz w:val="18"/>
+        </w:rPr>
+        <w:t>_to}})</w:t>
       </w:r>
     </w:p>
     <w:p>
@@ -1573,19 +1580,49 @@
         <w:rPr>
           <w:sz w:val="18"/>
         </w:rPr>
-        <w:t>name}} | {{certificate</w:t>
-      </w:r>
-      <w:r>
-        <w:rPr>
+        <w:t xml:space="preserve">name}} | </w:t>
+      </w:r>
+      <w:r>
+        <w:rPr>
+          <w:i/>
+          <w:iCs/>
+          <w:sz w:val="18"/>
+        </w:rPr>
+        <w:t>{{</w:t>
+      </w:r>
+      <w:proofErr w:type="gramStart"/>
+      <w:r>
+        <w:rPr>
+          <w:i/>
+          <w:iCs/>
+          <w:sz w:val="18"/>
+        </w:rPr>
+        <w:t>certificate</w:t>
+      </w:r>
+      <w:r>
+        <w:rPr>
+          <w:i/>
+          <w:iCs/>
           <w:sz w:val="18"/>
         </w:rPr>
         <w:t>.</w:t>
       </w:r>
       <w:r>
         <w:rPr>
-          <w:sz w:val="18"/>
-        </w:rPr>
-        <w:t>issuer}}</w:t>
+          <w:i/>
+          <w:iCs/>
+          <w:sz w:val="18"/>
+        </w:rPr>
+        <w:t>issuer</w:t>
+      </w:r>
+      <w:proofErr w:type="gramEnd"/>
+      <w:r>
+        <w:rPr>
+          <w:i/>
+          <w:iCs/>
+          <w:sz w:val="18"/>
+        </w:rPr>
+        <w:t>}}</w:t>
       </w:r>
     </w:p>
     <w:p>

</xml_diff>

<commit_message>
Release v2.1: UI enhancements and robust ATS generation
</commit_message>
<xml_diff>
--- a/backend/templates/resume_format.docx
+++ b/backend/templates/resume_format.docx
@@ -7,16 +7,16 @@
         <w:spacing w:after="0" w:line="360" w:lineRule="auto"/>
         <w:jc w:val="center"/>
         <w:rPr>
-          <w:sz w:val="32"/>
-          <w:szCs w:val="32"/>
+          <w:sz w:val="36"/>
+          <w:szCs w:val="36"/>
         </w:rPr>
       </w:pPr>
       <w:r>
         <w:rPr>
           <w:b/>
           <w:color w:val="4472C4"/>
-          <w:sz w:val="32"/>
-          <w:szCs w:val="32"/>
+          <w:sz w:val="36"/>
+          <w:szCs w:val="36"/>
         </w:rPr>
         <w:t>{{</w:t>
       </w:r>
@@ -24,8 +24,8 @@
         <w:rPr>
           <w:b/>
           <w:color w:val="4472C4"/>
-          <w:sz w:val="32"/>
-          <w:szCs w:val="32"/>
+          <w:sz w:val="36"/>
+          <w:szCs w:val="36"/>
         </w:rPr>
         <w:t>name</w:t>
       </w:r>
@@ -33,8 +33,8 @@
         <w:rPr>
           <w:b/>
           <w:color w:val="4472C4"/>
-          <w:sz w:val="32"/>
-          <w:szCs w:val="32"/>
+          <w:sz w:val="36"/>
+          <w:szCs w:val="36"/>
         </w:rPr>
         <w:t>}}</w:t>
       </w:r>
@@ -44,315 +44,270 @@
         <w:spacing w:after="0"/>
         <w:jc w:val="center"/>
         <w:rPr>
-          <w:sz w:val="18"/>
-        </w:rPr>
-      </w:pPr>
-      <w:r>
-        <w:rPr>
-          <w:sz w:val="18"/>
+          <w:sz w:val="20"/>
+          <w:szCs w:val="24"/>
+        </w:rPr>
+      </w:pPr>
+      <w:r>
+        <w:rPr>
+          <w:sz w:val="20"/>
+          <w:szCs w:val="24"/>
         </w:rPr>
         <w:t>{{</w:t>
       </w:r>
       <w:proofErr w:type="spellStart"/>
       <w:r>
         <w:rPr>
-          <w:sz w:val="18"/>
+          <w:sz w:val="20"/>
+          <w:szCs w:val="24"/>
         </w:rPr>
         <w:t>mobile_number</w:t>
       </w:r>
       <w:proofErr w:type="spellEnd"/>
       <w:r>
         <w:rPr>
-          <w:sz w:val="18"/>
+          <w:sz w:val="20"/>
+          <w:szCs w:val="24"/>
         </w:rPr>
         <w:t>}} |</w:t>
       </w:r>
       <w:r>
         <w:rPr>
-          <w:sz w:val="18"/>
+          <w:sz w:val="20"/>
+          <w:szCs w:val="24"/>
         </w:rPr>
         <w:t xml:space="preserve"> </w:t>
       </w:r>
       <w:r>
         <w:rPr>
-          <w:sz w:val="18"/>
+          <w:sz w:val="20"/>
+          <w:szCs w:val="24"/>
         </w:rPr>
         <w:t>{{</w:t>
       </w:r>
       <w:proofErr w:type="spellStart"/>
       <w:r>
         <w:rPr>
-          <w:sz w:val="18"/>
+          <w:sz w:val="20"/>
+          <w:szCs w:val="24"/>
         </w:rPr>
         <w:t>mail_id</w:t>
       </w:r>
       <w:proofErr w:type="spellEnd"/>
-      <w:proofErr w:type="gramStart"/>
-      <w:r>
-        <w:rPr>
-          <w:sz w:val="18"/>
+      <w:r>
+        <w:rPr>
+          <w:sz w:val="20"/>
+          <w:szCs w:val="24"/>
         </w:rPr>
         <w:t>}}</w:t>
       </w:r>
       <w:r>
         <w:rPr>
-          <w:sz w:val="18"/>
-        </w:rPr>
-        <w:t>{</w:t>
-      </w:r>
-      <w:proofErr w:type="gramEnd"/>
-      <w:r>
-        <w:rPr>
-          <w:sz w:val="18"/>
-        </w:rPr>
-        <w:t xml:space="preserve">% if </w:t>
+          <w:sz w:val="20"/>
+          <w:szCs w:val="24"/>
+        </w:rPr>
+        <w:t xml:space="preserve">{% if </w:t>
       </w:r>
       <w:proofErr w:type="spellStart"/>
       <w:r>
         <w:rPr>
-          <w:sz w:val="18"/>
-        </w:rPr>
-        <w:t>linkedin</w:t>
-      </w:r>
-      <w:r>
-        <w:rPr>
-          <w:sz w:val="18"/>
-        </w:rPr>
-        <w:t>_link</w:t>
+          <w:sz w:val="20"/>
+          <w:szCs w:val="24"/>
+        </w:rPr>
+        <w:t>linkedin_link</w:t>
       </w:r>
       <w:proofErr w:type="spellEnd"/>
       <w:r>
         <w:rPr>
-          <w:sz w:val="18"/>
+          <w:sz w:val="20"/>
+          <w:szCs w:val="24"/>
         </w:rPr>
         <w:t xml:space="preserve"> %}</w:t>
       </w:r>
       <w:r>
         <w:rPr>
-          <w:sz w:val="18"/>
+          <w:sz w:val="20"/>
+          <w:szCs w:val="24"/>
         </w:rPr>
         <w:t xml:space="preserve"> </w:t>
       </w:r>
       <w:r>
         <w:rPr>
-          <w:sz w:val="18"/>
+          <w:sz w:val="20"/>
+          <w:szCs w:val="24"/>
         </w:rPr>
         <w:t>|</w:t>
       </w:r>
       <w:r>
         <w:rPr>
-          <w:sz w:val="18"/>
+          <w:sz w:val="20"/>
+          <w:szCs w:val="24"/>
         </w:rPr>
         <w:t xml:space="preserve"> </w:t>
       </w:r>
       <w:r>
         <w:rPr>
-          <w:sz w:val="18"/>
+          <w:sz w:val="20"/>
+          <w:szCs w:val="24"/>
         </w:rPr>
         <w:t>{{</w:t>
       </w:r>
       <w:proofErr w:type="spellStart"/>
       <w:r>
         <w:rPr>
-          <w:sz w:val="18"/>
-        </w:rPr>
-        <w:t>linkedin</w:t>
-      </w:r>
-      <w:r>
-        <w:rPr>
-          <w:sz w:val="18"/>
-        </w:rPr>
-        <w:t>_link</w:t>
+          <w:sz w:val="20"/>
+          <w:szCs w:val="24"/>
+        </w:rPr>
+        <w:t>linkedin_link</w:t>
       </w:r>
       <w:proofErr w:type="spellEnd"/>
-      <w:proofErr w:type="gramStart"/>
-      <w:r>
-        <w:rPr>
-          <w:sz w:val="18"/>
-        </w:rPr>
-        <w:t>}}{</w:t>
-      </w:r>
-      <w:proofErr w:type="gramEnd"/>
-      <w:r>
-        <w:rPr>
-          <w:sz w:val="18"/>
-        </w:rPr>
-        <w:t xml:space="preserve">% endif </w:t>
-      </w:r>
-      <w:proofErr w:type="gramStart"/>
-      <w:r>
-        <w:rPr>
-          <w:sz w:val="18"/>
-        </w:rPr>
-        <w:t>%}{</w:t>
-      </w:r>
-      <w:proofErr w:type="gramEnd"/>
-      <w:r>
-        <w:rPr>
-          <w:sz w:val="18"/>
-        </w:rPr>
-        <w:t xml:space="preserve">% if </w:t>
+      <w:r>
+        <w:rPr>
+          <w:sz w:val="20"/>
+          <w:szCs w:val="24"/>
+        </w:rPr>
+        <w:t xml:space="preserve">}}{% endif %}{% if </w:t>
       </w:r>
       <w:proofErr w:type="spellStart"/>
       <w:r>
         <w:rPr>
-          <w:sz w:val="18"/>
-        </w:rPr>
-        <w:t>github</w:t>
-      </w:r>
-      <w:r>
-        <w:rPr>
-          <w:sz w:val="18"/>
-        </w:rPr>
-        <w:t>_link</w:t>
+          <w:sz w:val="20"/>
+          <w:szCs w:val="24"/>
+        </w:rPr>
+        <w:t>github_link</w:t>
       </w:r>
       <w:proofErr w:type="spellEnd"/>
       <w:r>
         <w:rPr>
-          <w:sz w:val="18"/>
+          <w:sz w:val="20"/>
+          <w:szCs w:val="24"/>
         </w:rPr>
         <w:t xml:space="preserve"> %}</w:t>
       </w:r>
       <w:r>
         <w:rPr>
-          <w:sz w:val="18"/>
+          <w:sz w:val="20"/>
+          <w:szCs w:val="24"/>
         </w:rPr>
         <w:t xml:space="preserve"> </w:t>
       </w:r>
       <w:r>
         <w:rPr>
-          <w:sz w:val="18"/>
+          <w:sz w:val="20"/>
+          <w:szCs w:val="24"/>
         </w:rPr>
         <w:t>|</w:t>
       </w:r>
       <w:r>
         <w:rPr>
-          <w:sz w:val="18"/>
+          <w:sz w:val="20"/>
+          <w:szCs w:val="24"/>
         </w:rPr>
         <w:t xml:space="preserve"> </w:t>
       </w:r>
       <w:r>
         <w:rPr>
-          <w:sz w:val="18"/>
+          <w:sz w:val="20"/>
+          <w:szCs w:val="24"/>
         </w:rPr>
         <w:t>{{</w:t>
       </w:r>
       <w:proofErr w:type="spellStart"/>
       <w:r>
         <w:rPr>
-          <w:sz w:val="18"/>
-        </w:rPr>
-        <w:t>github</w:t>
-      </w:r>
-      <w:r>
-        <w:rPr>
-          <w:sz w:val="18"/>
-        </w:rPr>
-        <w:t>_link</w:t>
+          <w:sz w:val="20"/>
+          <w:szCs w:val="24"/>
+        </w:rPr>
+        <w:t>github_link</w:t>
       </w:r>
       <w:proofErr w:type="spellEnd"/>
-      <w:proofErr w:type="gramStart"/>
-      <w:r>
-        <w:rPr>
-          <w:sz w:val="18"/>
-        </w:rPr>
-        <w:t>}}{</w:t>
-      </w:r>
-      <w:proofErr w:type="gramEnd"/>
-      <w:r>
-        <w:rPr>
-          <w:sz w:val="18"/>
-        </w:rPr>
-        <w:t xml:space="preserve">% endif </w:t>
-      </w:r>
-      <w:proofErr w:type="gramStart"/>
-      <w:r>
-        <w:rPr>
-          <w:sz w:val="18"/>
-        </w:rPr>
-        <w:t>%}{</w:t>
-      </w:r>
-      <w:proofErr w:type="gramEnd"/>
-      <w:r>
-        <w:rPr>
-          <w:sz w:val="18"/>
-        </w:rPr>
-        <w:t xml:space="preserve">% if </w:t>
+      <w:r>
+        <w:rPr>
+          <w:sz w:val="20"/>
+          <w:szCs w:val="24"/>
+        </w:rPr>
+        <w:t xml:space="preserve">}}{% endif %}{% if </w:t>
       </w:r>
       <w:proofErr w:type="spellStart"/>
       <w:r>
         <w:rPr>
-          <w:sz w:val="18"/>
+          <w:sz w:val="20"/>
+          <w:szCs w:val="24"/>
         </w:rPr>
         <w:t>portfolio_link</w:t>
       </w:r>
       <w:proofErr w:type="spellEnd"/>
       <w:r>
         <w:rPr>
-          <w:sz w:val="18"/>
+          <w:sz w:val="20"/>
+          <w:szCs w:val="24"/>
         </w:rPr>
         <w:t xml:space="preserve"> %}</w:t>
       </w:r>
       <w:r>
         <w:rPr>
-          <w:sz w:val="18"/>
+          <w:sz w:val="20"/>
+          <w:szCs w:val="24"/>
         </w:rPr>
         <w:t xml:space="preserve"> </w:t>
       </w:r>
       <w:r>
         <w:rPr>
-          <w:sz w:val="18"/>
+          <w:sz w:val="20"/>
+          <w:szCs w:val="24"/>
         </w:rPr>
         <w:t>|</w:t>
       </w:r>
       <w:r>
         <w:rPr>
-          <w:sz w:val="18"/>
+          <w:sz w:val="20"/>
+          <w:szCs w:val="24"/>
         </w:rPr>
         <w:t xml:space="preserve"> </w:t>
       </w:r>
       <w:r>
         <w:rPr>
-          <w:sz w:val="18"/>
+          <w:sz w:val="20"/>
+          <w:szCs w:val="24"/>
         </w:rPr>
         <w:t>{{</w:t>
       </w:r>
       <w:proofErr w:type="spellStart"/>
       <w:r>
         <w:rPr>
-          <w:sz w:val="18"/>
+          <w:sz w:val="20"/>
+          <w:szCs w:val="24"/>
         </w:rPr>
         <w:t>portfolio_link</w:t>
       </w:r>
       <w:proofErr w:type="spellEnd"/>
-      <w:proofErr w:type="gramStart"/>
-      <w:r>
-        <w:rPr>
-          <w:sz w:val="18"/>
-        </w:rPr>
-        <w:t>}}{</w:t>
-      </w:r>
-      <w:proofErr w:type="gramEnd"/>
-      <w:r>
-        <w:rPr>
-          <w:sz w:val="18"/>
-        </w:rPr>
-        <w:t>% endif %}</w:t>
+      <w:r>
+        <w:rPr>
+          <w:sz w:val="20"/>
+          <w:szCs w:val="24"/>
+        </w:rPr>
+        <w:t>}}{% endif %}</w:t>
       </w:r>
     </w:p>
     <w:p>
       <w:pPr>
         <w:spacing w:after="0"/>
         <w:jc w:val="center"/>
+        <w:rPr>
+          <w:sz w:val="24"/>
+          <w:szCs w:val="24"/>
+        </w:rPr>
       </w:pPr>
       <w:r>
         <w:rPr>
           <w:noProof/>
+          <w:sz w:val="24"/>
+          <w:szCs w:val="24"/>
         </w:rPr>
         <mc:AlternateContent>
           <mc:Choice Requires="wps">
             <w:drawing>
-              <wp:inline distT="0" distB="0" distL="0" distR="0">
+              <wp:inline distT="0" distB="0" distL="0" distR="0" wp14:anchorId="0AC3D5F1" wp14:editId="15F323DE">
                 <wp:extent cx="7092000" cy="0"/>
                 <wp:effectExtent l="0" t="0" r="7620" b="12700"/>
                 <wp:docPr id="164900547" name="Straight Connector 1"/>
@@ -412,12 +367,17 @@
     <w:p>
       <w:pPr>
         <w:spacing w:before="120" w:after="0" w:line="360" w:lineRule="auto"/>
+        <w:rPr>
+          <w:sz w:val="24"/>
+          <w:szCs w:val="24"/>
+        </w:rPr>
       </w:pPr>
       <w:r>
         <w:rPr>
           <w:b/>
           <w:color w:val="4472C4"/>
-          <w:sz w:val="24"/>
+          <w:sz w:val="28"/>
+          <w:szCs w:val="24"/>
         </w:rPr>
         <w:t>PROFESSIONAL SUMMARY</w:t>
       </w:r>
@@ -426,12 +386,14 @@
       <w:pPr>
         <w:spacing w:after="0"/>
         <w:rPr>
-          <w:sz w:val="18"/>
-        </w:rPr>
-      </w:pPr>
-      <w:r>
-        <w:rPr>
-          <w:sz w:val="18"/>
+          <w:sz w:val="20"/>
+          <w:szCs w:val="24"/>
+        </w:rPr>
+      </w:pPr>
+      <w:r>
+        <w:rPr>
+          <w:sz w:val="20"/>
+          <w:szCs w:val="24"/>
         </w:rPr>
         <w:t>{{summary}}</w:t>
       </w:r>
@@ -440,8 +402,8 @@
       <w:pPr>
         <w:spacing w:after="0"/>
         <w:rPr>
-          <w:sz w:val="18"/>
-          <w:szCs w:val="18"/>
+          <w:sz w:val="20"/>
+          <w:szCs w:val="20"/>
         </w:rPr>
       </w:pPr>
     </w:p>
@@ -451,14 +413,16 @@
         <w:rPr>
           <w:b/>
           <w:color w:val="4472C4"/>
-          <w:sz w:val="24"/>
+          <w:sz w:val="28"/>
+          <w:szCs w:val="24"/>
         </w:rPr>
       </w:pPr>
       <w:r>
         <w:rPr>
           <w:b/>
           <w:color w:val="4472C4"/>
-          <w:sz w:val="24"/>
+          <w:sz w:val="28"/>
+          <w:szCs w:val="24"/>
         </w:rPr>
         <w:t>TECHNICAL SKILLS</w:t>
       </w:r>
@@ -467,50 +431,30 @@
       <w:pPr>
         <w:spacing w:after="0"/>
         <w:rPr>
-          <w:sz w:val="18"/>
-        </w:rPr>
-      </w:pPr>
-      <w:r>
-        <w:rPr>
-          <w:sz w:val="18"/>
+          <w:sz w:val="20"/>
+          <w:szCs w:val="24"/>
+        </w:rPr>
+      </w:pPr>
+      <w:r>
+        <w:rPr>
+          <w:sz w:val="20"/>
+          <w:szCs w:val="24"/>
         </w:rPr>
         <w:t>{%</w:t>
       </w:r>
       <w:r>
         <w:rPr>
-          <w:sz w:val="18"/>
+          <w:sz w:val="20"/>
+          <w:szCs w:val="24"/>
         </w:rPr>
         <w:t>-</w:t>
       </w:r>
       <w:r>
         <w:rPr>
-          <w:sz w:val="18"/>
-        </w:rPr>
-        <w:t xml:space="preserve"> for </w:t>
-      </w:r>
-      <w:r>
-        <w:rPr>
-          <w:sz w:val="18"/>
-        </w:rPr>
-        <w:t>skill</w:t>
-      </w:r>
-      <w:r>
-        <w:rPr>
-          <w:sz w:val="18"/>
-        </w:rPr>
-        <w:t xml:space="preserve"> in </w:t>
-      </w:r>
-      <w:r>
-        <w:rPr>
-          <w:sz w:val="18"/>
-        </w:rPr>
-        <w:t>skills</w:t>
-      </w:r>
-      <w:r>
-        <w:rPr>
-          <w:sz w:val="18"/>
-        </w:rPr>
-        <w:t xml:space="preserve"> %}</w:t>
+          <w:sz w:val="20"/>
+          <w:szCs w:val="24"/>
+        </w:rPr>
+        <w:t xml:space="preserve"> for skill in skills %}</w:t>
       </w:r>
     </w:p>
     <w:p>
@@ -518,13 +462,15 @@
         <w:spacing w:after="0"/>
         <w:rPr>
           <w:bCs/>
-          <w:sz w:val="18"/>
+          <w:sz w:val="20"/>
+          <w:szCs w:val="24"/>
         </w:rPr>
       </w:pPr>
       <w:r>
         <w:rPr>
           <w:b/>
-          <w:sz w:val="18"/>
+          <w:sz w:val="20"/>
+          <w:szCs w:val="24"/>
         </w:rPr>
         <w:t>{{</w:t>
       </w:r>
@@ -533,14 +479,16 @@
       <w:r>
         <w:rPr>
           <w:b/>
-          <w:sz w:val="18"/>
+          <w:sz w:val="20"/>
+          <w:szCs w:val="24"/>
         </w:rPr>
         <w:t>skill.</w:t>
       </w:r>
       <w:r>
         <w:rPr>
           <w:b/>
-          <w:sz w:val="18"/>
+          <w:sz w:val="20"/>
+          <w:szCs w:val="24"/>
         </w:rPr>
         <w:t>main</w:t>
       </w:r>
@@ -548,7 +496,8 @@
       <w:r>
         <w:rPr>
           <w:b/>
-          <w:sz w:val="18"/>
+          <w:sz w:val="20"/>
+          <w:szCs w:val="24"/>
         </w:rPr>
         <w:t>_skill</w:t>
       </w:r>
@@ -556,14 +505,16 @@
       <w:r>
         <w:rPr>
           <w:b/>
-          <w:sz w:val="18"/>
+          <w:sz w:val="20"/>
+          <w:szCs w:val="24"/>
         </w:rPr>
         <w:t xml:space="preserve">}}: </w:t>
       </w:r>
       <w:r>
         <w:rPr>
           <w:bCs/>
-          <w:sz w:val="18"/>
+          <w:sz w:val="20"/>
+          <w:szCs w:val="24"/>
         </w:rPr>
         <w:t>{{</w:t>
       </w:r>
@@ -571,14 +522,16 @@
       <w:r>
         <w:rPr>
           <w:bCs/>
-          <w:sz w:val="18"/>
+          <w:sz w:val="20"/>
+          <w:szCs w:val="24"/>
         </w:rPr>
         <w:t>skill.</w:t>
       </w:r>
       <w:r>
         <w:rPr>
           <w:bCs/>
-          <w:sz w:val="18"/>
+          <w:sz w:val="20"/>
+          <w:szCs w:val="24"/>
         </w:rPr>
         <w:t>sub_skills</w:t>
       </w:r>
@@ -586,7 +539,8 @@
       <w:r>
         <w:rPr>
           <w:bCs/>
-          <w:sz w:val="18"/>
+          <w:sz w:val="20"/>
+          <w:szCs w:val="24"/>
         </w:rPr>
         <w:t>}}</w:t>
       </w:r>
@@ -595,38 +549,44 @@
       <w:pPr>
         <w:spacing w:after="0"/>
         <w:rPr>
-          <w:sz w:val="18"/>
-        </w:rPr>
-      </w:pPr>
-      <w:r>
-        <w:rPr>
-          <w:sz w:val="18"/>
+          <w:sz w:val="20"/>
+          <w:szCs w:val="24"/>
+        </w:rPr>
+      </w:pPr>
+      <w:r>
+        <w:rPr>
+          <w:sz w:val="20"/>
+          <w:szCs w:val="24"/>
         </w:rPr>
         <w:t>{%</w:t>
       </w:r>
       <w:r>
         <w:rPr>
-          <w:sz w:val="18"/>
+          <w:sz w:val="20"/>
+          <w:szCs w:val="24"/>
         </w:rPr>
         <w:t>-</w:t>
       </w:r>
       <w:r>
         <w:rPr>
-          <w:sz w:val="18"/>
+          <w:sz w:val="20"/>
+          <w:szCs w:val="24"/>
         </w:rPr>
         <w:t xml:space="preserve"> </w:t>
       </w:r>
       <w:proofErr w:type="spellStart"/>
       <w:r>
         <w:rPr>
-          <w:sz w:val="18"/>
+          <w:sz w:val="20"/>
+          <w:szCs w:val="24"/>
         </w:rPr>
         <w:t>endfor</w:t>
       </w:r>
       <w:proofErr w:type="spellEnd"/>
       <w:r>
         <w:rPr>
-          <w:sz w:val="18"/>
+          <w:sz w:val="20"/>
+          <w:szCs w:val="24"/>
         </w:rPr>
         <w:t xml:space="preserve"> %}</w:t>
       </w:r>
@@ -635,7 +595,8 @@
       <w:pPr>
         <w:spacing w:after="0"/>
         <w:rPr>
-          <w:sz w:val="18"/>
+          <w:sz w:val="20"/>
+          <w:szCs w:val="24"/>
         </w:rPr>
       </w:pPr>
     </w:p>
@@ -645,14 +606,16 @@
         <w:rPr>
           <w:b/>
           <w:color w:val="4472C4"/>
-          <w:sz w:val="24"/>
+          <w:sz w:val="28"/>
+          <w:szCs w:val="24"/>
         </w:rPr>
       </w:pPr>
       <w:r>
         <w:rPr>
           <w:b/>
           <w:color w:val="4472C4"/>
-          <w:sz w:val="24"/>
+          <w:sz w:val="28"/>
+          <w:szCs w:val="24"/>
         </w:rPr>
         <w:t>PROFESSIONAL EXPERIENCE</w:t>
       </w:r>
@@ -661,60 +624,31 @@
       <w:pPr>
         <w:spacing w:after="0"/>
         <w:rPr>
-          <w:sz w:val="18"/>
-        </w:rPr>
-      </w:pPr>
-      <w:r>
-        <w:rPr>
-          <w:sz w:val="18"/>
-        </w:rPr>
-        <w:t>{%</w:t>
-      </w:r>
-      <w:r>
-        <w:rPr>
-          <w:sz w:val="18"/>
-        </w:rPr>
-        <w:t>-</w:t>
-      </w:r>
-      <w:r>
-        <w:rPr>
-          <w:sz w:val="18"/>
-        </w:rPr>
-        <w:t xml:space="preserve"> for </w:t>
-      </w:r>
-      <w:r>
-        <w:rPr>
-          <w:sz w:val="18"/>
-        </w:rPr>
-        <w:t>company</w:t>
-      </w:r>
-      <w:r>
-        <w:rPr>
-          <w:sz w:val="18"/>
-        </w:rPr>
-        <w:t xml:space="preserve"> in </w:t>
-      </w:r>
-      <w:r>
-        <w:rPr>
-          <w:sz w:val="18"/>
-        </w:rPr>
-        <w:t>companies</w:t>
-      </w:r>
-      <w:r>
-        <w:rPr>
-          <w:sz w:val="18"/>
-        </w:rPr>
-        <w:t xml:space="preserve"> %}</w:t>
+          <w:sz w:val="20"/>
+          <w:szCs w:val="24"/>
+        </w:rPr>
+      </w:pPr>
+      <w:r>
+        <w:rPr>
+          <w:sz w:val="20"/>
+          <w:szCs w:val="24"/>
+        </w:rPr>
+        <w:t>{%- for company in companies %}</w:t>
       </w:r>
     </w:p>
     <w:p>
       <w:pPr>
         <w:spacing w:after="0"/>
+        <w:rPr>
+          <w:sz w:val="24"/>
+          <w:szCs w:val="24"/>
+        </w:rPr>
       </w:pPr>
       <w:r>
         <w:rPr>
           <w:b/>
-          <w:sz w:val="18"/>
+          <w:sz w:val="20"/>
+          <w:szCs w:val="24"/>
         </w:rPr>
         <w:t>{{</w:t>
       </w:r>
@@ -724,14 +658,16 @@
         <w:rPr>
           <w:b/>
           <w:bCs/>
-          <w:sz w:val="18"/>
+          <w:sz w:val="20"/>
+          <w:szCs w:val="24"/>
         </w:rPr>
         <w:t>company</w:t>
       </w:r>
       <w:r>
         <w:rPr>
           <w:b/>
-          <w:sz w:val="18"/>
+          <w:sz w:val="20"/>
+          <w:szCs w:val="24"/>
         </w:rPr>
         <w:t>.position</w:t>
       </w:r>
@@ -740,7 +676,8 @@
       <w:r>
         <w:rPr>
           <w:b/>
-          <w:sz w:val="18"/>
+          <w:sz w:val="20"/>
+          <w:szCs w:val="24"/>
         </w:rPr>
         <w:t xml:space="preserve">}} | </w:t>
       </w:r>
@@ -748,7 +685,8 @@
         <w:rPr>
           <w:i/>
           <w:iCs/>
-          <w:sz w:val="18"/>
+          <w:sz w:val="20"/>
+          <w:szCs w:val="24"/>
         </w:rPr>
         <w:t>{{company.name}} ({{</w:t>
       </w:r>
@@ -758,7 +696,8 @@
         <w:rPr>
           <w:i/>
           <w:iCs/>
-          <w:sz w:val="18"/>
+          <w:sz w:val="20"/>
+          <w:szCs w:val="24"/>
         </w:rPr>
         <w:t>company.from</w:t>
       </w:r>
@@ -768,7 +707,8 @@
         <w:rPr>
           <w:i/>
           <w:iCs/>
-          <w:sz w:val="18"/>
+          <w:sz w:val="20"/>
+          <w:szCs w:val="24"/>
         </w:rPr>
         <w:t>}} – {{company.to}})</w:t>
       </w:r>
@@ -777,12 +717,14 @@
       <w:pPr>
         <w:spacing w:after="0"/>
         <w:rPr>
-          <w:sz w:val="18"/>
-        </w:rPr>
-      </w:pPr>
-      <w:r>
-        <w:rPr>
-          <w:sz w:val="18"/>
+          <w:sz w:val="20"/>
+          <w:szCs w:val="24"/>
+        </w:rPr>
+      </w:pPr>
+      <w:r>
+        <w:rPr>
+          <w:sz w:val="20"/>
+          <w:szCs w:val="24"/>
         </w:rPr>
         <w:t xml:space="preserve">{%- for point in </w:t>
       </w:r>
@@ -790,7 +732,8 @@
       <w:proofErr w:type="gramStart"/>
       <w:r>
         <w:rPr>
-          <w:sz w:val="18"/>
+          <w:sz w:val="20"/>
+          <w:szCs w:val="24"/>
         </w:rPr>
         <w:t>company.experience</w:t>
       </w:r>
@@ -798,7 +741,8 @@
       <w:proofErr w:type="gramEnd"/>
       <w:r>
         <w:rPr>
-          <w:sz w:val="18"/>
+          <w:sz w:val="20"/>
+          <w:szCs w:val="24"/>
         </w:rPr>
         <w:t xml:space="preserve"> %}</w:t>
       </w:r>
@@ -813,12 +757,14 @@
         <w:spacing w:after="0"/>
         <w:ind w:left="700"/>
         <w:rPr>
-          <w:sz w:val="18"/>
-        </w:rPr>
-      </w:pPr>
-      <w:r>
-        <w:rPr>
-          <w:sz w:val="18"/>
+          <w:sz w:val="20"/>
+          <w:szCs w:val="24"/>
+        </w:rPr>
+      </w:pPr>
+      <w:r>
+        <w:rPr>
+          <w:sz w:val="20"/>
+          <w:szCs w:val="24"/>
         </w:rPr>
         <w:t>{{point}}</w:t>
       </w:r>
@@ -827,38 +773,30 @@
       <w:pPr>
         <w:spacing w:after="0"/>
         <w:rPr>
-          <w:sz w:val="18"/>
-        </w:rPr>
-      </w:pPr>
-      <w:r>
-        <w:rPr>
-          <w:sz w:val="18"/>
-        </w:rPr>
-        <w:t>{%</w:t>
-      </w:r>
-      <w:r>
-        <w:rPr>
-          <w:sz w:val="18"/>
-        </w:rPr>
-        <w:t>-</w:t>
-      </w:r>
-      <w:r>
-        <w:rPr>
-          <w:sz w:val="18"/>
-        </w:rPr>
-        <w:t xml:space="preserve"> </w:t>
+          <w:sz w:val="20"/>
+          <w:szCs w:val="24"/>
+        </w:rPr>
+      </w:pPr>
+      <w:r>
+        <w:rPr>
+          <w:sz w:val="20"/>
+          <w:szCs w:val="24"/>
+        </w:rPr>
+        <w:t xml:space="preserve">{%- </w:t>
       </w:r>
       <w:proofErr w:type="spellStart"/>
       <w:r>
         <w:rPr>
-          <w:sz w:val="18"/>
+          <w:sz w:val="20"/>
+          <w:szCs w:val="24"/>
         </w:rPr>
         <w:t>endfor</w:t>
       </w:r>
       <w:proofErr w:type="spellEnd"/>
       <w:r>
         <w:rPr>
-          <w:sz w:val="18"/>
+          <w:sz w:val="20"/>
+          <w:szCs w:val="24"/>
         </w:rPr>
         <w:t xml:space="preserve"> %}</w:t>
       </w:r>
@@ -867,26 +805,30 @@
       <w:pPr>
         <w:spacing w:after="0"/>
         <w:rPr>
-          <w:sz w:val="18"/>
-        </w:rPr>
-      </w:pPr>
-      <w:r>
-        <w:rPr>
-          <w:sz w:val="18"/>
+          <w:sz w:val="20"/>
+          <w:szCs w:val="24"/>
+        </w:rPr>
+      </w:pPr>
+      <w:r>
+        <w:rPr>
+          <w:sz w:val="20"/>
+          <w:szCs w:val="24"/>
         </w:rPr>
         <w:t xml:space="preserve">{% </w:t>
       </w:r>
       <w:proofErr w:type="spellStart"/>
       <w:r>
         <w:rPr>
-          <w:sz w:val="18"/>
+          <w:sz w:val="20"/>
+          <w:szCs w:val="24"/>
         </w:rPr>
         <w:t>endfor</w:t>
       </w:r>
       <w:proofErr w:type="spellEnd"/>
       <w:r>
         <w:rPr>
-          <w:sz w:val="18"/>
+          <w:sz w:val="20"/>
+          <w:szCs w:val="24"/>
         </w:rPr>
         <w:t xml:space="preserve"> %}</w:t>
       </w:r>
@@ -897,14 +839,16 @@
         <w:rPr>
           <w:b/>
           <w:color w:val="4472C4"/>
-          <w:sz w:val="24"/>
+          <w:sz w:val="28"/>
+          <w:szCs w:val="24"/>
         </w:rPr>
       </w:pPr>
       <w:r>
         <w:rPr>
           <w:b/>
           <w:color w:val="4472C4"/>
-          <w:sz w:val="24"/>
+          <w:sz w:val="28"/>
+          <w:szCs w:val="24"/>
         </w:rPr>
         <w:t>PROJECTS</w:t>
       </w:r>
@@ -913,36 +857,31 @@
       <w:pPr>
         <w:spacing w:after="0"/>
         <w:rPr>
-          <w:sz w:val="18"/>
-        </w:rPr>
-      </w:pPr>
-      <w:r>
-        <w:rPr>
-          <w:sz w:val="18"/>
-        </w:rPr>
-        <w:t>{%</w:t>
-      </w:r>
-      <w:r>
-        <w:rPr>
-          <w:sz w:val="18"/>
-        </w:rPr>
-        <w:t>-</w:t>
-      </w:r>
-      <w:r>
-        <w:rPr>
-          <w:sz w:val="18"/>
-        </w:rPr>
-        <w:t xml:space="preserve"> for project in projects %}</w:t>
+          <w:sz w:val="20"/>
+          <w:szCs w:val="24"/>
+        </w:rPr>
+      </w:pPr>
+      <w:r>
+        <w:rPr>
+          <w:sz w:val="20"/>
+          <w:szCs w:val="24"/>
+        </w:rPr>
+        <w:t>{%- for project in projects %}</w:t>
       </w:r>
     </w:p>
     <w:p>
       <w:pPr>
         <w:spacing w:after="0"/>
+        <w:rPr>
+          <w:sz w:val="24"/>
+          <w:szCs w:val="24"/>
+        </w:rPr>
       </w:pPr>
       <w:r>
         <w:rPr>
           <w:b/>
-          <w:sz w:val="18"/>
+          <w:sz w:val="20"/>
+          <w:szCs w:val="24"/>
         </w:rPr>
         <w:t>{{</w:t>
       </w:r>
@@ -951,7 +890,8 @@
       <w:r>
         <w:rPr>
           <w:b/>
-          <w:sz w:val="18"/>
+          <w:sz w:val="20"/>
+          <w:szCs w:val="24"/>
         </w:rPr>
         <w:t>project.title</w:t>
       </w:r>
@@ -960,7 +900,8 @@
       <w:r>
         <w:rPr>
           <w:b/>
-          <w:sz w:val="18"/>
+          <w:sz w:val="20"/>
+          <w:szCs w:val="24"/>
         </w:rPr>
         <w:t xml:space="preserve">}} | </w:t>
       </w:r>
@@ -968,7 +909,8 @@
         <w:rPr>
           <w:i/>
           <w:iCs/>
-          <w:sz w:val="18"/>
+          <w:sz w:val="20"/>
+          <w:szCs w:val="24"/>
         </w:rPr>
         <w:t>{{</w:t>
       </w:r>
@@ -978,7 +920,8 @@
         <w:rPr>
           <w:i/>
           <w:iCs/>
-          <w:sz w:val="18"/>
+          <w:sz w:val="20"/>
+          <w:szCs w:val="24"/>
         </w:rPr>
         <w:t>project.tools</w:t>
       </w:r>
@@ -987,7 +930,8 @@
         <w:rPr>
           <w:i/>
           <w:iCs/>
-          <w:sz w:val="18"/>
+          <w:sz w:val="20"/>
+          <w:szCs w:val="24"/>
         </w:rPr>
         <w:t>_used</w:t>
       </w:r>
@@ -997,7 +941,8 @@
         <w:rPr>
           <w:i/>
           <w:iCs/>
-          <w:sz w:val="18"/>
+          <w:sz w:val="20"/>
+          <w:szCs w:val="24"/>
         </w:rPr>
         <w:t>}}{</w:t>
       </w:r>
@@ -1006,7 +951,8 @@
         <w:rPr>
           <w:i/>
           <w:iCs/>
-          <w:sz w:val="18"/>
+          <w:sz w:val="20"/>
+          <w:szCs w:val="24"/>
         </w:rPr>
         <w:t xml:space="preserve">% if </w:t>
       </w:r>
@@ -1016,7 +962,8 @@
         <w:rPr>
           <w:i/>
           <w:iCs/>
-          <w:sz w:val="18"/>
+          <w:sz w:val="20"/>
+          <w:szCs w:val="24"/>
         </w:rPr>
         <w:t>project.project</w:t>
       </w:r>
@@ -1025,7 +972,8 @@
         <w:rPr>
           <w:i/>
           <w:iCs/>
-          <w:sz w:val="18"/>
+          <w:sz w:val="20"/>
+          <w:szCs w:val="24"/>
         </w:rPr>
         <w:t>_link</w:t>
       </w:r>
@@ -1034,7 +982,8 @@
         <w:rPr>
           <w:i/>
           <w:iCs/>
-          <w:sz w:val="18"/>
+          <w:sz w:val="20"/>
+          <w:szCs w:val="24"/>
         </w:rPr>
         <w:t xml:space="preserve"> %} | {{</w:t>
       </w:r>
@@ -1044,7 +993,8 @@
         <w:rPr>
           <w:i/>
           <w:iCs/>
-          <w:sz w:val="18"/>
+          <w:sz w:val="20"/>
+          <w:szCs w:val="24"/>
         </w:rPr>
         <w:t>project.project</w:t>
       </w:r>
@@ -1053,7 +1003,8 @@
         <w:rPr>
           <w:i/>
           <w:iCs/>
-          <w:sz w:val="18"/>
+          <w:sz w:val="20"/>
+          <w:szCs w:val="24"/>
         </w:rPr>
         <w:t>_link</w:t>
       </w:r>
@@ -1063,7 +1014,8 @@
         <w:rPr>
           <w:i/>
           <w:iCs/>
-          <w:sz w:val="18"/>
+          <w:sz w:val="20"/>
+          <w:szCs w:val="24"/>
         </w:rPr>
         <w:t>}}{</w:t>
       </w:r>
@@ -1072,7 +1024,8 @@
         <w:rPr>
           <w:i/>
           <w:iCs/>
-          <w:sz w:val="18"/>
+          <w:sz w:val="20"/>
+          <w:szCs w:val="24"/>
         </w:rPr>
         <w:t>% endif %}</w:t>
       </w:r>
@@ -1081,12 +1034,14 @@
       <w:pPr>
         <w:spacing w:after="0"/>
         <w:rPr>
-          <w:sz w:val="18"/>
-        </w:rPr>
-      </w:pPr>
-      <w:r>
-        <w:rPr>
-          <w:sz w:val="18"/>
+          <w:sz w:val="20"/>
+          <w:szCs w:val="24"/>
+        </w:rPr>
+      </w:pPr>
+      <w:r>
+        <w:rPr>
+          <w:sz w:val="20"/>
+          <w:szCs w:val="24"/>
         </w:rPr>
         <w:t xml:space="preserve">{%- for point in </w:t>
       </w:r>
@@ -1094,21 +1049,24 @@
       <w:proofErr w:type="gramStart"/>
       <w:r>
         <w:rPr>
-          <w:sz w:val="18"/>
+          <w:sz w:val="20"/>
+          <w:szCs w:val="24"/>
         </w:rPr>
         <w:t>project.project</w:t>
       </w:r>
       <w:proofErr w:type="gramEnd"/>
       <w:r>
         <w:rPr>
-          <w:sz w:val="18"/>
+          <w:sz w:val="20"/>
+          <w:szCs w:val="24"/>
         </w:rPr>
         <w:t>_details</w:t>
       </w:r>
       <w:proofErr w:type="spellEnd"/>
       <w:r>
         <w:rPr>
-          <w:sz w:val="18"/>
+          <w:sz w:val="20"/>
+          <w:szCs w:val="24"/>
         </w:rPr>
         <w:t xml:space="preserve"> %}</w:t>
       </w:r>
@@ -1123,12 +1081,14 @@
         <w:spacing w:after="0"/>
         <w:ind w:left="700"/>
         <w:rPr>
-          <w:sz w:val="18"/>
-        </w:rPr>
-      </w:pPr>
-      <w:r>
-        <w:rPr>
-          <w:sz w:val="18"/>
+          <w:sz w:val="20"/>
+          <w:szCs w:val="24"/>
+        </w:rPr>
+      </w:pPr>
+      <w:r>
+        <w:rPr>
+          <w:sz w:val="20"/>
+          <w:szCs w:val="24"/>
         </w:rPr>
         <w:t>{{point}}</w:t>
       </w:r>
@@ -1137,26 +1097,30 @@
       <w:pPr>
         <w:spacing w:after="0"/>
         <w:rPr>
-          <w:sz w:val="18"/>
-        </w:rPr>
-      </w:pPr>
-      <w:r>
-        <w:rPr>
-          <w:sz w:val="18"/>
+          <w:sz w:val="20"/>
+          <w:szCs w:val="24"/>
+        </w:rPr>
+      </w:pPr>
+      <w:r>
+        <w:rPr>
+          <w:sz w:val="20"/>
+          <w:szCs w:val="24"/>
         </w:rPr>
         <w:t xml:space="preserve">{%- </w:t>
       </w:r>
       <w:proofErr w:type="spellStart"/>
       <w:r>
         <w:rPr>
-          <w:sz w:val="18"/>
+          <w:sz w:val="20"/>
+          <w:szCs w:val="24"/>
         </w:rPr>
         <w:t>endfor</w:t>
       </w:r>
       <w:proofErr w:type="spellEnd"/>
       <w:r>
         <w:rPr>
-          <w:sz w:val="18"/>
+          <w:sz w:val="20"/>
+          <w:szCs w:val="24"/>
         </w:rPr>
         <w:t xml:space="preserve"> %}</w:t>
       </w:r>
@@ -1165,26 +1129,30 @@
       <w:pPr>
         <w:spacing w:after="0"/>
         <w:rPr>
-          <w:sz w:val="18"/>
-        </w:rPr>
-      </w:pPr>
-      <w:r>
-        <w:rPr>
-          <w:sz w:val="18"/>
+          <w:sz w:val="20"/>
+          <w:szCs w:val="24"/>
+        </w:rPr>
+      </w:pPr>
+      <w:r>
+        <w:rPr>
+          <w:sz w:val="20"/>
+          <w:szCs w:val="24"/>
         </w:rPr>
         <w:t xml:space="preserve">{% </w:t>
       </w:r>
       <w:proofErr w:type="spellStart"/>
       <w:r>
         <w:rPr>
-          <w:sz w:val="18"/>
+          <w:sz w:val="20"/>
+          <w:szCs w:val="24"/>
         </w:rPr>
         <w:t>endfor</w:t>
       </w:r>
       <w:proofErr w:type="spellEnd"/>
       <w:r>
         <w:rPr>
-          <w:sz w:val="18"/>
+          <w:sz w:val="20"/>
+          <w:szCs w:val="24"/>
         </w:rPr>
         <w:t xml:space="preserve"> %}</w:t>
       </w:r>
@@ -1195,14 +1163,16 @@
         <w:rPr>
           <w:b/>
           <w:color w:val="4472C4"/>
-          <w:sz w:val="24"/>
+          <w:sz w:val="28"/>
+          <w:szCs w:val="24"/>
         </w:rPr>
       </w:pPr>
       <w:r>
         <w:rPr>
           <w:b/>
           <w:color w:val="4472C4"/>
-          <w:sz w:val="24"/>
+          <w:sz w:val="28"/>
+          <w:szCs w:val="24"/>
         </w:rPr>
         <w:t>EDUCATION</w:t>
       </w:r>
@@ -1211,120 +1181,111 @@
       <w:pPr>
         <w:spacing w:after="0"/>
         <w:rPr>
-          <w:sz w:val="18"/>
-        </w:rPr>
-      </w:pPr>
-      <w:r>
-        <w:rPr>
-          <w:sz w:val="18"/>
+          <w:sz w:val="20"/>
+          <w:szCs w:val="24"/>
+        </w:rPr>
+      </w:pPr>
+      <w:r>
+        <w:rPr>
+          <w:sz w:val="20"/>
+          <w:szCs w:val="24"/>
         </w:rPr>
         <w:t>{%</w:t>
       </w:r>
       <w:r>
         <w:rPr>
-          <w:sz w:val="18"/>
+          <w:sz w:val="20"/>
+          <w:szCs w:val="24"/>
         </w:rPr>
         <w:t>-</w:t>
       </w:r>
       <w:r>
         <w:rPr>
-          <w:sz w:val="18"/>
-        </w:rPr>
-        <w:t xml:space="preserve"> for </w:t>
-      </w:r>
-      <w:r>
-        <w:rPr>
-          <w:sz w:val="18"/>
-        </w:rPr>
-        <w:t>education</w:t>
-      </w:r>
-      <w:r>
-        <w:rPr>
-          <w:sz w:val="18"/>
-        </w:rPr>
-        <w:t xml:space="preserve"> in </w:t>
-      </w:r>
-      <w:r>
-        <w:rPr>
-          <w:sz w:val="18"/>
-        </w:rPr>
-        <w:t>educations</w:t>
-      </w:r>
-      <w:r>
-        <w:rPr>
-          <w:sz w:val="18"/>
-        </w:rPr>
-        <w:t xml:space="preserve"> %}</w:t>
+          <w:sz w:val="20"/>
+          <w:szCs w:val="24"/>
+        </w:rPr>
+        <w:t xml:space="preserve"> for education in educations %}</w:t>
       </w:r>
     </w:p>
     <w:p>
       <w:pPr>
         <w:spacing w:after="0"/>
         <w:rPr>
-          <w:sz w:val="18"/>
-        </w:rPr>
-      </w:pPr>
-      <w:r>
-        <w:rPr>
-          <w:sz w:val="18"/>
+          <w:sz w:val="20"/>
+          <w:szCs w:val="24"/>
+        </w:rPr>
+      </w:pPr>
+      <w:r>
+        <w:rPr>
+          <w:sz w:val="20"/>
+          <w:szCs w:val="24"/>
         </w:rPr>
         <w:t>{{</w:t>
       </w:r>
       <w:proofErr w:type="gramStart"/>
       <w:r>
         <w:rPr>
-          <w:sz w:val="18"/>
+          <w:sz w:val="20"/>
+          <w:szCs w:val="24"/>
         </w:rPr>
         <w:t>education</w:t>
       </w:r>
       <w:r>
         <w:rPr>
-          <w:sz w:val="18"/>
+          <w:sz w:val="20"/>
+          <w:szCs w:val="24"/>
         </w:rPr>
         <w:t>.</w:t>
       </w:r>
       <w:r>
         <w:rPr>
-          <w:sz w:val="18"/>
+          <w:sz w:val="20"/>
+          <w:szCs w:val="24"/>
         </w:rPr>
         <w:t>field</w:t>
       </w:r>
       <w:proofErr w:type="gramEnd"/>
       <w:r>
         <w:rPr>
-          <w:sz w:val="18"/>
+          <w:sz w:val="20"/>
+          <w:szCs w:val="24"/>
         </w:rPr>
         <w:t>}} in {{</w:t>
       </w:r>
       <w:proofErr w:type="gramStart"/>
       <w:r>
         <w:rPr>
-          <w:sz w:val="18"/>
+          <w:sz w:val="20"/>
+          <w:szCs w:val="24"/>
         </w:rPr>
         <w:t>education</w:t>
       </w:r>
       <w:r>
         <w:rPr>
-          <w:sz w:val="18"/>
+          <w:sz w:val="20"/>
+          <w:szCs w:val="24"/>
         </w:rPr>
         <w:t>.</w:t>
       </w:r>
       <w:r>
         <w:rPr>
-          <w:sz w:val="18"/>
+          <w:sz w:val="20"/>
+          <w:szCs w:val="24"/>
         </w:rPr>
         <w:t>sub</w:t>
       </w:r>
       <w:r>
         <w:rPr>
-          <w:sz w:val="18"/>
+          <w:sz w:val="20"/>
+          <w:szCs w:val="24"/>
         </w:rPr>
         <w:t>ject</w:t>
       </w:r>
       <w:proofErr w:type="gramEnd"/>
       <w:r>
         <w:rPr>
-          <w:sz w:val="18"/>
+          <w:sz w:val="20"/>
+          <w:szCs w:val="24"/>
         </w:rPr>
         <w:t xml:space="preserve">}} | </w:t>
       </w:r>
@@ -1332,7 +1293,8 @@
         <w:rPr>
           <w:i/>
           <w:iCs/>
-          <w:sz w:val="18"/>
+          <w:sz w:val="20"/>
+          <w:szCs w:val="24"/>
         </w:rPr>
         <w:t>{{</w:t>
       </w:r>
@@ -1341,7 +1303,8 @@
         <w:rPr>
           <w:i/>
           <w:iCs/>
-          <w:sz w:val="18"/>
+          <w:sz w:val="20"/>
+          <w:szCs w:val="24"/>
         </w:rPr>
         <w:t>education.</w:t>
       </w:r>
@@ -1349,7 +1312,8 @@
         <w:rPr>
           <w:i/>
           <w:iCs/>
-          <w:sz w:val="18"/>
+          <w:sz w:val="20"/>
+          <w:szCs w:val="24"/>
         </w:rPr>
         <w:t>college</w:t>
       </w:r>
@@ -1358,7 +1322,8 @@
         <w:rPr>
           <w:i/>
           <w:iCs/>
-          <w:sz w:val="18"/>
+          <w:sz w:val="20"/>
+          <w:szCs w:val="24"/>
         </w:rPr>
         <w:t>}} ({{</w:t>
       </w:r>
@@ -1367,7 +1332,8 @@
         <w:rPr>
           <w:i/>
           <w:iCs/>
-          <w:sz w:val="18"/>
+          <w:sz w:val="20"/>
+          <w:szCs w:val="24"/>
         </w:rPr>
         <w:t>education.</w:t>
       </w:r>
@@ -1375,7 +1341,8 @@
         <w:rPr>
           <w:i/>
           <w:iCs/>
-          <w:sz w:val="18"/>
+          <w:sz w:val="20"/>
+          <w:szCs w:val="24"/>
         </w:rPr>
         <w:t>college</w:t>
       </w:r>
@@ -1384,7 +1351,8 @@
         <w:rPr>
           <w:i/>
           <w:iCs/>
-          <w:sz w:val="18"/>
+          <w:sz w:val="20"/>
+          <w:szCs w:val="24"/>
         </w:rPr>
         <w:t>_from}} – {{</w:t>
       </w:r>
@@ -1393,7 +1361,8 @@
         <w:rPr>
           <w:i/>
           <w:iCs/>
-          <w:sz w:val="18"/>
+          <w:sz w:val="20"/>
+          <w:szCs w:val="24"/>
         </w:rPr>
         <w:t>education.</w:t>
       </w:r>
@@ -1401,7 +1370,8 @@
         <w:rPr>
           <w:i/>
           <w:iCs/>
-          <w:sz w:val="18"/>
+          <w:sz w:val="20"/>
+          <w:szCs w:val="24"/>
         </w:rPr>
         <w:t>college</w:t>
       </w:r>
@@ -1410,7 +1380,8 @@
         <w:rPr>
           <w:i/>
           <w:iCs/>
-          <w:sz w:val="18"/>
+          <w:sz w:val="20"/>
+          <w:szCs w:val="24"/>
         </w:rPr>
         <w:t>_to}})</w:t>
       </w:r>
@@ -1419,38 +1390,44 @@
       <w:pPr>
         <w:spacing w:after="0"/>
         <w:rPr>
-          <w:sz w:val="18"/>
-        </w:rPr>
-      </w:pPr>
-      <w:r>
-        <w:rPr>
-          <w:sz w:val="18"/>
+          <w:sz w:val="20"/>
+          <w:szCs w:val="24"/>
+        </w:rPr>
+      </w:pPr>
+      <w:r>
+        <w:rPr>
+          <w:sz w:val="20"/>
+          <w:szCs w:val="24"/>
         </w:rPr>
         <w:t>{%</w:t>
       </w:r>
       <w:r>
         <w:rPr>
-          <w:sz w:val="18"/>
+          <w:sz w:val="20"/>
+          <w:szCs w:val="24"/>
         </w:rPr>
         <w:t>-</w:t>
       </w:r>
       <w:r>
         <w:rPr>
-          <w:sz w:val="18"/>
+          <w:sz w:val="20"/>
+          <w:szCs w:val="24"/>
         </w:rPr>
         <w:t xml:space="preserve"> </w:t>
       </w:r>
       <w:proofErr w:type="spellStart"/>
       <w:r>
         <w:rPr>
-          <w:sz w:val="18"/>
+          <w:sz w:val="20"/>
+          <w:szCs w:val="24"/>
         </w:rPr>
         <w:t>endfor</w:t>
       </w:r>
       <w:proofErr w:type="spellEnd"/>
       <w:r>
         <w:rPr>
-          <w:sz w:val="18"/>
+          <w:sz w:val="20"/>
+          <w:szCs w:val="24"/>
         </w:rPr>
         <w:t xml:space="preserve"> %}</w:t>
       </w:r>
@@ -1461,30 +1438,28 @@
         <w:rPr>
           <w:b/>
           <w:color w:val="4472C4"/>
-          <w:sz w:val="24"/>
-        </w:rPr>
-      </w:pPr>
-      <w:r>
-        <w:rPr>
-          <w:sz w:val="18"/>
+          <w:sz w:val="28"/>
+          <w:szCs w:val="24"/>
+        </w:rPr>
+      </w:pPr>
+      <w:r>
+        <w:rPr>
+          <w:sz w:val="20"/>
+          <w:szCs w:val="24"/>
         </w:rPr>
         <w:t xml:space="preserve">{% if </w:t>
       </w:r>
       <w:r>
         <w:rPr>
-          <w:sz w:val="18"/>
-        </w:rPr>
-        <w:t>certificates</w:t>
-      </w:r>
-      <w:r>
-        <w:rPr>
-          <w:sz w:val="18"/>
-        </w:rPr>
-        <w:t xml:space="preserve"> </w:t>
-      </w:r>
-      <w:r>
-        <w:rPr>
-          <w:sz w:val="18"/>
+          <w:sz w:val="20"/>
+          <w:szCs w:val="24"/>
+        </w:rPr>
+        <w:t xml:space="preserve">certificates </w:t>
+      </w:r>
+      <w:r>
+        <w:rPr>
+          <w:sz w:val="20"/>
+          <w:szCs w:val="24"/>
         </w:rPr>
         <w:t>%}</w:t>
       </w:r>
@@ -1495,14 +1470,16 @@
         <w:rPr>
           <w:b/>
           <w:color w:val="4472C4"/>
-          <w:sz w:val="24"/>
+          <w:sz w:val="28"/>
+          <w:szCs w:val="24"/>
         </w:rPr>
       </w:pPr>
       <w:r>
         <w:rPr>
           <w:b/>
           <w:color w:val="4472C4"/>
-          <w:sz w:val="24"/>
+          <w:sz w:val="28"/>
+          <w:szCs w:val="24"/>
         </w:rPr>
         <w:t>CERTIFICATIONS</w:t>
       </w:r>
@@ -1511,74 +1488,58 @@
       <w:pPr>
         <w:spacing w:after="0"/>
         <w:rPr>
-          <w:sz w:val="18"/>
-        </w:rPr>
-      </w:pPr>
-      <w:r>
-        <w:rPr>
-          <w:sz w:val="18"/>
+          <w:sz w:val="20"/>
+          <w:szCs w:val="24"/>
+        </w:rPr>
+      </w:pPr>
+      <w:r>
+        <w:rPr>
+          <w:sz w:val="20"/>
+          <w:szCs w:val="24"/>
         </w:rPr>
         <w:t>{%</w:t>
       </w:r>
       <w:r>
         <w:rPr>
-          <w:sz w:val="18"/>
+          <w:sz w:val="20"/>
+          <w:szCs w:val="24"/>
         </w:rPr>
         <w:t>-</w:t>
       </w:r>
       <w:r>
         <w:rPr>
-          <w:sz w:val="18"/>
-        </w:rPr>
-        <w:t xml:space="preserve"> for </w:t>
-      </w:r>
-      <w:r>
-        <w:rPr>
-          <w:sz w:val="18"/>
-        </w:rPr>
-        <w:t>certificate</w:t>
-      </w:r>
-      <w:r>
-        <w:rPr>
-          <w:sz w:val="18"/>
-        </w:rPr>
-        <w:t xml:space="preserve"> in </w:t>
-      </w:r>
-      <w:r>
-        <w:rPr>
-          <w:sz w:val="18"/>
-        </w:rPr>
-        <w:t>certificates</w:t>
-      </w:r>
-      <w:r>
-        <w:rPr>
-          <w:sz w:val="18"/>
-        </w:rPr>
-        <w:t xml:space="preserve"> %}</w:t>
+          <w:sz w:val="20"/>
+          <w:szCs w:val="24"/>
+        </w:rPr>
+        <w:t xml:space="preserve"> for certificate in certificates %}</w:t>
       </w:r>
     </w:p>
     <w:p>
       <w:pPr>
         <w:spacing w:after="0"/>
         <w:rPr>
-          <w:sz w:val="18"/>
-        </w:rPr>
-      </w:pPr>
-      <w:r>
-        <w:rPr>
-          <w:sz w:val="18"/>
+          <w:sz w:val="20"/>
+          <w:szCs w:val="24"/>
+        </w:rPr>
+      </w:pPr>
+      <w:r>
+        <w:rPr>
+          <w:sz w:val="20"/>
+          <w:szCs w:val="24"/>
         </w:rPr>
         <w:t>{{certificate</w:t>
       </w:r>
       <w:r>
         <w:rPr>
-          <w:sz w:val="18"/>
+          <w:sz w:val="20"/>
+          <w:szCs w:val="24"/>
         </w:rPr>
         <w:t>.</w:t>
       </w:r>
       <w:r>
         <w:rPr>
-          <w:sz w:val="18"/>
+          <w:sz w:val="20"/>
+          <w:szCs w:val="24"/>
         </w:rPr>
         <w:t xml:space="preserve">name}} | </w:t>
       </w:r>
@@ -1586,7 +1547,8 @@
         <w:rPr>
           <w:i/>
           <w:iCs/>
-          <w:sz w:val="18"/>
+          <w:sz w:val="20"/>
+          <w:szCs w:val="24"/>
         </w:rPr>
         <w:t>{{</w:t>
       </w:r>
@@ -1595,7 +1557,8 @@
         <w:rPr>
           <w:i/>
           <w:iCs/>
-          <w:sz w:val="18"/>
+          <w:sz w:val="20"/>
+          <w:szCs w:val="24"/>
         </w:rPr>
         <w:t>certificate</w:t>
       </w:r>
@@ -1603,7 +1566,8 @@
         <w:rPr>
           <w:i/>
           <w:iCs/>
-          <w:sz w:val="18"/>
+          <w:sz w:val="20"/>
+          <w:szCs w:val="24"/>
         </w:rPr>
         <w:t>.</w:t>
       </w:r>
@@ -1611,7 +1575,8 @@
         <w:rPr>
           <w:i/>
           <w:iCs/>
-          <w:sz w:val="18"/>
+          <w:sz w:val="20"/>
+          <w:szCs w:val="24"/>
         </w:rPr>
         <w:t>issuer</w:t>
       </w:r>
@@ -1620,7 +1585,8 @@
         <w:rPr>
           <w:i/>
           <w:iCs/>
-          <w:sz w:val="18"/>
+          <w:sz w:val="20"/>
+          <w:szCs w:val="24"/>
         </w:rPr>
         <w:t>}}</w:t>
       </w:r>
@@ -1629,38 +1595,44 @@
       <w:pPr>
         <w:spacing w:after="0"/>
         <w:rPr>
-          <w:sz w:val="18"/>
-        </w:rPr>
-      </w:pPr>
-      <w:r>
-        <w:rPr>
-          <w:sz w:val="18"/>
+          <w:sz w:val="20"/>
+          <w:szCs w:val="24"/>
+        </w:rPr>
+      </w:pPr>
+      <w:r>
+        <w:rPr>
+          <w:sz w:val="20"/>
+          <w:szCs w:val="24"/>
         </w:rPr>
         <w:t>{%</w:t>
       </w:r>
       <w:r>
         <w:rPr>
-          <w:sz w:val="18"/>
+          <w:sz w:val="20"/>
+          <w:szCs w:val="24"/>
         </w:rPr>
         <w:t>-</w:t>
       </w:r>
       <w:r>
         <w:rPr>
-          <w:sz w:val="18"/>
+          <w:sz w:val="20"/>
+          <w:szCs w:val="24"/>
         </w:rPr>
         <w:t xml:space="preserve"> </w:t>
       </w:r>
       <w:proofErr w:type="spellStart"/>
       <w:r>
         <w:rPr>
-          <w:sz w:val="18"/>
+          <w:sz w:val="20"/>
+          <w:szCs w:val="24"/>
         </w:rPr>
         <w:t>endfor</w:t>
       </w:r>
       <w:proofErr w:type="spellEnd"/>
       <w:r>
         <w:rPr>
-          <w:sz w:val="18"/>
+          <w:sz w:val="20"/>
+          <w:szCs w:val="24"/>
         </w:rPr>
         <w:t xml:space="preserve"> %}</w:t>
       </w:r>
@@ -1669,12 +1641,14 @@
       <w:pPr>
         <w:spacing w:after="0"/>
         <w:rPr>
-          <w:sz w:val="18"/>
-        </w:rPr>
-      </w:pPr>
-      <w:r>
-        <w:rPr>
-          <w:sz w:val="18"/>
+          <w:sz w:val="20"/>
+          <w:szCs w:val="24"/>
+        </w:rPr>
+      </w:pPr>
+      <w:r>
+        <w:rPr>
+          <w:sz w:val="20"/>
+          <w:szCs w:val="24"/>
         </w:rPr>
         <w:t>{% endif %}</w:t>
       </w:r>

</xml_diff>